<commit_message>
step(5.6): add reader feedback, RAG eval set with must-refuse scoring, close the Phase 5 docs loop
Learned: feedback loops as live evals, must-refuse cases as the other half of correctness, evaluating the production path with real seeded content, baselines before thresholds, anonymous-create/admin-resolve asymmetry, idempotent state transitions vs one-shot verdicts

Co-Authored-By: Claude Fable 5 <noreply@anthropic.com>
Claude-Session: https://claude.ai/code/session_01XCaaD2oSfQhWv3vNENZDue
</commit_message>
<xml_diff>
--- a/docs/deliverables/out/AiSafety.docx
+++ b/docs/deliverables/out/AiSafety.docx
@@ -245,6 +245,56 @@
           </w:p>
         </w:tc>
       </w:tr>
+      <w:tr>
+        <w:tc>
+          <w:tcPr/>
+          <w:p>
+            <w:pPr>
+              <w:pStyle w:val="Compact"/>
+              <w:jc w:val="left"/>
+            </w:pPr>
+            <w:r>
+              <w:t xml:space="preserve">0.2</w:t>
+            </w:r>
+          </w:p>
+        </w:tc>
+        <w:tc>
+          <w:tcPr/>
+          <w:p>
+            <w:pPr>
+              <w:pStyle w:val="Compact"/>
+              <w:jc w:val="left"/>
+            </w:pPr>
+            <w:r>
+              <w:t xml:space="preserve">2026-09-07</w:t>
+            </w:r>
+          </w:p>
+        </w:tc>
+        <w:tc>
+          <w:tcPr/>
+          <w:p>
+            <w:pPr>
+              <w:pStyle w:val="Compact"/>
+              <w:jc w:val="left"/>
+            </w:pPr>
+            <w:r>
+              <w:t xml:space="preserve">Abdulsalam</w:t>
+            </w:r>
+          </w:p>
+        </w:tc>
+        <w:tc>
+          <w:tcPr/>
+          <w:p>
+            <w:pPr>
+              <w:pStyle w:val="Compact"/>
+              <w:jc w:val="left"/>
+            </w:pPr>
+            <w:r>
+              <w:t xml:space="preserve">§8 Grounded chat (RAG): grounding chain, citation validation, refusal paths, RAG eval method (roadmap step 5.6)</w:t>
+            </w:r>
+          </w:p>
+        </w:tc>
+      </w:tr>
     </w:tbl>
     <w:p>
       <w:pPr>
@@ -2168,13 +2218,49 @@
       </w:tr>
     </w:tbl>
     <w:bookmarkEnd w:id="27"/>
-    <w:bookmarkStart w:id="28" w:name="planned-hardening"/>
+    <w:bookmarkStart w:id="28" w:name="X518847a8bd8ee408ccbf3fb90eef703fa382ad7"/>
     <w:p>
       <w:pPr>
         <w:pStyle w:val="Heading1"/>
       </w:pPr>
       <w:r>
-        <w:t xml:space="preserve">8. Planned hardening</w:t>
+        <w:rPr>
+          <w:rStyle w:val="SectionNumber"/>
+        </w:rPr>
+        <w:t xml:space="preserve">8</w:t>
+      </w:r>
+      <w:r>
+        <w:tab/>
+      </w:r>
+      <w:r>
+        <w:t xml:space="preserve">8. Grounded chat (RAG) — FR-GDE-002/003, FR-AI-003</w:t>
+      </w:r>
+    </w:p>
+    <w:p>
+      <w:pPr>
+        <w:pStyle w:val="FirstParagraph"/>
+      </w:pPr>
+      <w:r>
+        <w:t xml:space="preserve">The guides chat answers</w:t>
+      </w:r>
+      <w:r>
+        <w:t xml:space="preserve"> </w:t>
+      </w:r>
+      <w:r>
+        <w:rPr>
+          <w:bCs/>
+          <w:b/>
+        </w:rPr>
+        <w:t xml:space="preserve">only from retrieved, published guide content</w:t>
+      </w:r>
+      <w:r>
+        <w:t xml:space="preserve">. The safety chain, in</w:t>
+      </w:r>
+      <w:r>
+        <w:t xml:space="preserve"> </w:t>
+      </w:r>
+      <w:r>
+        <w:t xml:space="preserve">order, with the layer that enforces each link:</w:t>
       </w:r>
     </w:p>
     <w:p>
@@ -2186,34 +2272,66 @@
         <w:pStyle w:val="Compact"/>
       </w:pPr>
       <w:r>
-        <w:t xml:space="preserve">P8: encryption at rest for attachments and</w:t>
-      </w:r>
-      <w:r>
-        <w:t xml:space="preserve"> </w:t>
-      </w:r>
-      <w:r>
-        <w:rPr>
-          <w:rStyle w:val="VerbatimChar"/>
-        </w:rPr>
-        <w:t xml:space="preserve">OcrText</w:t>
-      </w:r>
-      <w:r>
-        <w:t xml:space="preserve">/</w:t>
-      </w:r>
-      <w:r>
-        <w:rPr>
-          <w:rStyle w:val="VerbatimChar"/>
-        </w:rPr>
-        <w:t xml:space="preserve">RawJson</w:t>
-      </w:r>
-      <w:r>
-        <w:t xml:space="preserve">; purge of extraction PII 90</w:t>
-      </w:r>
-      <w:r>
-        <w:t xml:space="preserve"> </w:t>
-      </w:r>
-      <w:r>
-        <w:t xml:space="preserve">days after acceptance; hard-delete flow.</w:t>
+        <w:rPr>
+          <w:bCs/>
+          <w:b/>
+        </w:rPr>
+        <w:t xml:space="preserve">Corpus scope</w:t>
+      </w:r>
+      <w:r>
+        <w:t xml:space="preserve"> </w:t>
+      </w:r>
+      <w:r>
+        <w:t xml:space="preserve">(</w:t>
+      </w:r>
+      <w:r>
+        <w:rPr>
+          <w:rStyle w:val="VerbatimChar"/>
+        </w:rPr>
+        <w:t xml:space="preserve">GuideRetriever</w:t>
+      </w:r>
+      <w:r>
+        <w:t xml:space="preserve">): only</w:t>
+      </w:r>
+      <w:r>
+        <w:t xml:space="preserve"> </w:t>
+      </w:r>
+      <w:r>
+        <w:rPr>
+          <w:iCs/>
+          <w:i/>
+        </w:rPr>
+        <w:t xml:space="preserve">served</w:t>
+      </w:r>
+      <w:r>
+        <w:t xml:space="preserve"> </w:t>
+      </w:r>
+      <w:r>
+        <w:t xml:space="preserve">content is searchable — active guides,</w:t>
+      </w:r>
+      <w:r>
+        <w:t xml:space="preserve"> </w:t>
+      </w:r>
+      <w:r>
+        <w:t xml:space="preserve">latest published version per language. Drafts and superseded versions are never candidates</w:t>
+      </w:r>
+      <w:r>
+        <w:t xml:space="preserve"> </w:t>
+      </w:r>
+      <w:r>
+        <w:t xml:space="preserve">(their chunks remain in SQL so past citations stay resolvable). Chunks embedded by a</w:t>
+      </w:r>
+      <w:r>
+        <w:t xml:space="preserve"> </w:t>
+      </w:r>
+      <w:r>
+        <w:t xml:space="preserve">different model than the current one are invisible, not low-scoring — vectors from different</w:t>
+      </w:r>
+      <w:r>
+        <w:t xml:space="preserve"> </w:t>
+      </w:r>
+      <w:r>
+        <w:t xml:space="preserve">models share no space.</w:t>
       </w:r>
     </w:p>
     <w:p>
@@ -2225,7 +2343,75 @@
         <w:pStyle w:val="Compact"/>
       </w:pPr>
       <w:r>
-        <w:t xml:space="preserve">Phase 5: guides RAG grounding + citation checks (its own section here when built).</w:t>
+        <w:rPr>
+          <w:bCs/>
+          <w:b/>
+        </w:rPr>
+        <w:t xml:space="preserve">Similarity floor</w:t>
+      </w:r>
+      <w:r>
+        <w:t xml:space="preserve"> </w:t>
+      </w:r>
+      <w:r>
+        <w:t xml:space="preserve">(config</w:t>
+      </w:r>
+      <w:r>
+        <w:t xml:space="preserve"> </w:t>
+      </w:r>
+      <w:r>
+        <w:rPr>
+          <w:rStyle w:val="VerbatimChar"/>
+        </w:rPr>
+        <w:t xml:space="preserve">Guides:Retrieval</w:t>
+      </w:r>
+      <w:r>
+        <w:t xml:space="preserve">, default 0.5): below it, the corpus</w:t>
+      </w:r>
+      <w:r>
+        <w:t xml:space="preserve"> </w:t>
+      </w:r>
+      <w:r>
+        <w:t xml:space="preserve">“</w:t>
+      </w:r>
+      <w:r>
+        <w:t xml:space="preserve">does</w:t>
+      </w:r>
+      <w:r>
+        <w:t xml:space="preserve"> </w:t>
+      </w:r>
+      <w:r>
+        <w:t xml:space="preserve">not speak to this question</w:t>
+      </w:r>
+      <w:r>
+        <w:t xml:space="preserve">”</w:t>
+      </w:r>
+      <w:r>
+        <w:t xml:space="preserve"> </w:t>
+      </w:r>
+      <w:r>
+        <w:t xml:space="preserve">and the pipeline refuses before any chat-model call. An empty</w:t>
+      </w:r>
+      <w:r>
+        <w:t xml:space="preserve"> </w:t>
+      </w:r>
+      <w:r>
+        <w:t xml:space="preserve">corpus refuses before even the</w:t>
+      </w:r>
+      <w:r>
+        <w:t xml:space="preserve"> </w:t>
+      </w:r>
+      <w:r>
+        <w:rPr>
+          <w:iCs/>
+          <w:i/>
+        </w:rPr>
+        <w:t xml:space="preserve">embedding</w:t>
+      </w:r>
+      <w:r>
+        <w:t xml:space="preserve"> </w:t>
+      </w:r>
+      <w:r>
+        <w:t xml:space="preserve">call.</w:t>
       </w:r>
     </w:p>
     <w:p>
@@ -2237,10 +2423,616 @@
         <w:pStyle w:val="Compact"/>
       </w:pPr>
       <w:r>
+        <w:rPr>
+          <w:bCs/>
+          <w:b/>
+        </w:rPr>
+        <w:t xml:space="preserve">Label isolation</w:t>
+      </w:r>
+      <w:r>
+        <w:t xml:space="preserve"> </w:t>
+      </w:r>
+      <w:r>
+        <w:t xml:space="preserve">(</w:t>
+      </w:r>
+      <w:r>
+        <w:rPr>
+          <w:rStyle w:val="VerbatimChar"/>
+        </w:rPr>
+        <w:t xml:space="preserve">ChatAppService</w:t>
+      </w:r>
+      <w:r>
+        <w:t xml:space="preserve"> </w:t>
+      </w:r>
+      <w:r>
+        <w:t xml:space="preserve">→</w:t>
+      </w:r>
+      <w:r>
+        <w:t xml:space="preserve"> </w:t>
+      </w:r>
+      <w:r>
+        <w:rPr>
+          <w:rStyle w:val="VerbatimChar"/>
+        </w:rPr>
+        <w:t xml:space="preserve">IGuideAnswerer</w:t>
+      </w:r>
+      <w:r>
+        <w:t xml:space="preserve">): the model receives excerpts as</w:t>
+      </w:r>
+      <w:r>
+        <w:t xml:space="preserve"> </w:t>
+      </w:r>
+      <w:r>
+        <w:t xml:space="preserve">opaque labels</w:t>
+      </w:r>
+      <w:r>
+        <w:t xml:space="preserve"> </w:t>
+      </w:r>
+      <w:r>
+        <w:rPr>
+          <w:rStyle w:val="VerbatimChar"/>
+        </w:rPr>
+        <w:t xml:space="preserve">C1..Cn</w:t>
+      </w:r>
+      <w:r>
+        <w:t xml:space="preserve"> </w:t>
+      </w:r>
+      <w:r>
+        <w:t xml:space="preserve">with text — never real ids. It cannot leak, guess or mangle a chunk</w:t>
+      </w:r>
+      <w:r>
+        <w:t xml:space="preserve"> </w:t>
+      </w:r>
+      <w:r>
+        <w:t xml:space="preserve">or version id, and an invented label is trivially detectable.</w:t>
+      </w:r>
+    </w:p>
+    <w:p>
+      <w:pPr>
+        <w:numPr>
+          <w:ilvl w:val="0"/>
+          <w:numId w:val="1006"/>
+        </w:numPr>
+        <w:pStyle w:val="Compact"/>
+      </w:pPr>
+      <w:r>
+        <w:rPr>
+          <w:bCs/>
+          <w:b/>
+        </w:rPr>
+        <w:t xml:space="preserve">Versioned grounding prompt</w:t>
+      </w:r>
+      <w:r>
+        <w:t xml:space="preserve"> </w:t>
+      </w:r>
+      <w:r>
+        <w:t xml:space="preserve">(</w:t>
+      </w:r>
+      <w:r>
+        <w:rPr>
+          <w:rStyle w:val="VerbatimChar"/>
+        </w:rPr>
+        <w:t xml:space="preserve">guides-chat@v1</w:t>
+      </w:r>
+      <w:r>
+        <w:t xml:space="preserve">, embedded resource, pinned name): answer</w:t>
+      </w:r>
+      <w:r>
+        <w:t xml:space="preserve"> </w:t>
+      </w:r>
+      <w:r>
+        <w:t xml:space="preserve">only from excerpts, refuse with</w:t>
+      </w:r>
+      <w:r>
+        <w:t xml:space="preserve"> </w:t>
+      </w:r>
+      <w:r>
+        <w:rPr>
+          <w:rStyle w:val="VerbatimChar"/>
+        </w:rPr>
+        <w:t xml:space="preserve">answer: null</w:t>
+      </w:r>
+      <w:r>
+        <w:t xml:space="preserve"> </w:t>
+      </w:r>
+      <w:r>
+        <w:t xml:space="preserve">otherwise, cite every excerpt used. The</w:t>
+      </w:r>
+      <w:r>
+        <w:t xml:space="preserve"> </w:t>
+      </w:r>
+      <w:r>
+        <w:t xml:space="preserve">version string rides into every</w:t>
+      </w:r>
+      <w:r>
+        <w:t xml:space="preserve"> </w:t>
+      </w:r>
+      <w:r>
+        <w:rPr>
+          <w:rStyle w:val="VerbatimChar"/>
+        </w:rPr>
+        <w:t xml:space="preserve">ai.Usage</w:t>
+      </w:r>
+      <w:r>
+        <w:t xml:space="preserve"> </w:t>
+      </w:r>
+      <w:r>
+        <w:t xml:space="preserve">row (purpose</w:t>
+      </w:r>
+      <w:r>
+        <w:t xml:space="preserve"> </w:t>
+      </w:r>
+      <w:r>
+        <w:rPr>
+          <w:rStyle w:val="VerbatimChar"/>
+        </w:rPr>
+        <w:t xml:space="preserve">GuideChat</w:t>
+      </w:r>
+      <w:r>
+        <w:t xml:space="preserve">) via the 3.3 decorator —</w:t>
+      </w:r>
+      <w:r>
+        <w:t xml:space="preserve"> </w:t>
+      </w:r>
+      <w:r>
+        <w:t xml:space="preserve">the cap applies, which is why chat requires sign-in while reading stays anonymous.</w:t>
+      </w:r>
+    </w:p>
+    <w:p>
+      <w:pPr>
+        <w:numPr>
+          <w:ilvl w:val="0"/>
+          <w:numId w:val="1006"/>
+        </w:numPr>
+        <w:pStyle w:val="Compact"/>
+      </w:pPr>
+      <w:r>
+        <w:rPr>
+          <w:bCs/>
+          <w:b/>
+        </w:rPr>
+        <w:t xml:space="preserve">Parse defensively</w:t>
+      </w:r>
+      <w:r>
+        <w:t xml:space="preserve"> </w:t>
+      </w:r>
+      <w:r>
+        <w:t xml:space="preserve">(</w:t>
+      </w:r>
+      <w:r>
+        <w:rPr>
+          <w:rStyle w:val="VerbatimChar"/>
+        </w:rPr>
+        <w:t xml:space="preserve">GuideAnswerParser</w:t>
+      </w:r>
+      <w:r>
+        <w:t xml:space="preserve">): prose, torn JSON, citation noise — every</w:t>
+      </w:r>
+      <w:r>
+        <w:t xml:space="preserve"> </w:t>
+      </w:r>
+      <w:r>
+        <w:t xml:space="preserve">malformed output degrades to a refusal, never an exception, never a served answer.</w:t>
+      </w:r>
+    </w:p>
+    <w:p>
+      <w:pPr>
+        <w:numPr>
+          <w:ilvl w:val="0"/>
+          <w:numId w:val="1006"/>
+        </w:numPr>
+        <w:pStyle w:val="Compact"/>
+      </w:pPr>
+      <w:r>
+        <w:rPr>
+          <w:bCs/>
+          <w:b/>
+        </w:rPr>
+        <w:t xml:space="preserve">Citation validation</w:t>
+      </w:r>
+      <w:r>
+        <w:t xml:space="preserve"> </w:t>
+      </w:r>
+      <w:r>
+        <w:t xml:space="preserve">(</w:t>
+      </w:r>
+      <w:r>
+        <w:rPr>
+          <w:rStyle w:val="VerbatimChar"/>
+        </w:rPr>
+        <w:t xml:space="preserve">ChatAppService</w:t>
+      </w:r>
+      <w:r>
+        <w:t xml:space="preserve">): cited labels are mapped back against the set</w:t>
+      </w:r>
+      <w:r>
+        <w:t xml:space="preserve"> </w:t>
+      </w:r>
+      <w:r>
+        <w:t xml:space="preserve">retrieved</w:t>
+      </w:r>
+      <w:r>
+        <w:t xml:space="preserve"> </w:t>
+      </w:r>
+      <w:r>
+        <w:rPr>
+          <w:iCs/>
+          <w:i/>
+        </w:rPr>
+        <w:t xml:space="preserve">for this request</w:t>
+      </w:r>
+      <w:r>
+        <w:t xml:space="preserve">. Invented citations are dropped and flagged</w:t>
+      </w:r>
+      <w:r>
+        <w:t xml:space="preserve"> </w:t>
+      </w:r>
+      <w:r>
+        <w:t xml:space="preserve">(</w:t>
+      </w:r>
+      <w:r>
+        <w:rPr>
+          <w:rStyle w:val="VerbatimChar"/>
+        </w:rPr>
+        <w:t xml:space="preserve">hallucinatedCitationsDropped</w:t>
+      </w:r>
+      <w:r>
+        <w:t xml:space="preserve">); an answer left with</w:t>
+      </w:r>
+      <w:r>
+        <w:t xml:space="preserve"> </w:t>
+      </w:r>
+      <w:r>
+        <w:rPr>
+          <w:bCs/>
+          <w:b/>
+        </w:rPr>
+        <w:t xml:space="preserve">zero</w:t>
+      </w:r>
+      <w:r>
+        <w:t xml:space="preserve"> </w:t>
+      </w:r>
+      <w:r>
+        <w:t xml:space="preserve">valid citations is refused</w:t>
+      </w:r>
+      <w:r>
+        <w:t xml:space="preserve"> </w:t>
+      </w:r>
+      <w:r>
+        <w:t xml:space="preserve">whole — grounding is definitional, not decorative.</w:t>
+      </w:r>
+    </w:p>
+    <w:p>
+      <w:pPr>
+        <w:numPr>
+          <w:ilvl w:val="0"/>
+          <w:numId w:val="1006"/>
+        </w:numPr>
+        <w:pStyle w:val="Compact"/>
+      </w:pPr>
+      <w:r>
+        <w:rPr>
+          <w:bCs/>
+          <w:b/>
+        </w:rPr>
+        <w:t xml:space="preserve">Freshness on every answer</w:t>
+      </w:r>
+      <w:r>
+        <w:t xml:space="preserve"> </w:t>
+      </w:r>
+      <w:r>
+        <w:t xml:space="preserve">(Vision R2): each citation carries its source version’s</w:t>
+      </w:r>
+      <w:r>
+        <w:t xml:space="preserve"> </w:t>
+      </w:r>
+      <w:r>
+        <w:rPr>
+          <w:rStyle w:val="VerbatimChar"/>
+        </w:rPr>
+        <w:t xml:space="preserve">LastVerifiedAt</w:t>
+      </w:r>
+      <w:r>
+        <w:t xml:space="preserve">; the answer-level date is the</w:t>
+      </w:r>
+      <w:r>
+        <w:t xml:space="preserve"> </w:t>
+      </w:r>
+      <w:r>
+        <w:rPr>
+          <w:bCs/>
+          <w:b/>
+        </w:rPr>
+        <w:t xml:space="preserve">oldest</w:t>
+      </w:r>
+      <w:r>
+        <w:t xml:space="preserve"> </w:t>
+      </w:r>
+      <w:r>
+        <w:t xml:space="preserve">cited source — an answer is only</w:t>
+      </w:r>
+      <w:r>
+        <w:t xml:space="preserve"> </w:t>
+      </w:r>
+      <w:r>
+        <w:t xml:space="preserve">as fresh as its stalest ingredient.</w:t>
+      </w:r>
+    </w:p>
+    <w:p>
+      <w:pPr>
+        <w:numPr>
+          <w:ilvl w:val="0"/>
+          <w:numId w:val="1006"/>
+        </w:numPr>
+        <w:pStyle w:val="Compact"/>
+      </w:pPr>
+      <w:r>
+        <w:rPr>
+          <w:bCs/>
+          <w:b/>
+        </w:rPr>
+        <w:t xml:space="preserve">Reader feedback</w:t>
+      </w:r>
+      <w:r>
+        <w:t xml:space="preserve"> </w:t>
+      </w:r>
+      <w:r>
+        <w:t xml:space="preserve">(</w:t>
+      </w:r>
+      <w:r>
+        <w:rPr>
+          <w:rStyle w:val="VerbatimChar"/>
+        </w:rPr>
+        <w:t xml:space="preserve">GuideFeedback</w:t>
+      </w:r>
+      <w:r>
+        <w:t xml:space="preserve">): any reader — anonymous included — can flag a version</w:t>
+      </w:r>
+      <w:r>
+        <w:t xml:space="preserve"> </w:t>
+      </w:r>
+      <w:r>
+        <w:t xml:space="preserve">as outdated/wrong; flags land in an admin queue (list + resolve). The correction loop for</w:t>
+      </w:r>
+      <w:r>
+        <w:t xml:space="preserve"> </w:t>
+      </w:r>
+      <w:r>
+        <w:t xml:space="preserve">everything the layers above cannot know.</w:t>
+      </w:r>
+    </w:p>
+    <w:p>
+      <w:pPr>
+        <w:pStyle w:val="FirstParagraph"/>
+      </w:pPr>
+      <w:r>
+        <w:rPr>
+          <w:bCs/>
+          <w:b/>
+        </w:rPr>
+        <w:t xml:space="preserve">RAG evaluation method</w:t>
+      </w:r>
+      <w:r>
+        <w:t xml:space="preserve"> </w:t>
+      </w:r>
+      <w:r>
+        <w:t xml:space="preserve">(the §6 philosophy at conversation level): a 10-case bilingual set of</w:t>
+      </w:r>
+      <w:r>
+        <w:t xml:space="preserve"> </w:t>
+      </w:r>
+      <w:r>
+        <w:t xml:space="preserve">grounded Q&amp;A pairs — 6 answerable from the seeded guide,</w:t>
+      </w:r>
+      <w:r>
+        <w:t xml:space="preserve"> </w:t>
+      </w:r>
+      <w:r>
+        <w:rPr>
+          <w:bCs/>
+          <w:b/>
+        </w:rPr>
+        <w:t xml:space="preserve">4 must-refuse</w:t>
+      </w:r>
+      <w:r>
+        <w:t xml:space="preserve"> </w:t>
+      </w:r>
+      <w:r>
+        <w:t xml:space="preserve">(off-topic and</w:t>
+      </w:r>
+      <w:r>
+        <w:t xml:space="preserve"> </w:t>
+      </w:r>
+      <w:r>
+        <w:t xml:space="preserve">guides-that-don’t-exist-yet). A refusal case scores a point only for silence: a set without</w:t>
+      </w:r>
+      <w:r>
+        <w:t xml:space="preserve"> </w:t>
+      </w:r>
+      <w:r>
+        <w:t xml:space="preserve">must-refuse cases cannot distinguish a grounded assistant from a confident liar. The</w:t>
+      </w:r>
+      <w:r>
+        <w:t xml:space="preserve"> </w:t>
+      </w:r>
+      <w:r>
+        <w:rPr>
+          <w:rStyle w:val="VerbatimChar"/>
+        </w:rPr>
+        <w:t xml:space="preserve">[OllamaFact]</w:t>
+      </w:r>
+      <w:r>
+        <w:t xml:space="preserve">-gated runner (</w:t>
+      </w:r>
+      <w:r>
+        <w:rPr>
+          <w:rStyle w:val="VerbatimChar"/>
+        </w:rPr>
+        <w:t xml:space="preserve">Rag_Eval_Scores_The_Live_Pipeline</w:t>
+      </w:r>
+      <w:r>
+        <w:t xml:space="preserve">) chunks and embeds the real</w:t>
+      </w:r>
+      <w:r>
+        <w:t xml:space="preserve"> </w:t>
+      </w:r>
+      <w:r>
+        <w:t xml:space="preserve">seeded guide with the production chunker + bge-m3, retrieves with the production math and</w:t>
+      </w:r>
+      <w:r>
+        <w:t xml:space="preserve"> </w:t>
+      </w:r>
+      <w:r>
+        <w:t xml:space="preserve">defaults, answers through the real</w:t>
+      </w:r>
+      <w:r>
+        <w:t xml:space="preserve"> </w:t>
+      </w:r>
+      <w:r>
+        <w:rPr>
+          <w:rStyle w:val="VerbatimChar"/>
+        </w:rPr>
+        <w:t xml:space="preserve">GuideAnswerer</w:t>
+      </w:r>
+      <w:r>
+        <w:t xml:space="preserve">, and replicates the service’s citation</w:t>
+      </w:r>
+      <w:r>
+        <w:t xml:space="preserve"> </w:t>
+      </w:r>
+      <w:r>
+        <w:t xml:space="preserve">policy. Metrics: answer rate, refusal accuracy, clean-citation rate — floors at 50% reject a</w:t>
+      </w:r>
+      <w:r>
+        <w:t xml:space="preserve"> </w:t>
+      </w:r>
+      <w:r>
+        <w:t xml:space="preserve">broken pipeline; record per prompt version here after each dev-box run</w:t>
+      </w:r>
+      <w:r>
+        <w:t xml:space="preserve"> </w:t>
+      </w:r>
+      <w:r>
+        <w:t xml:space="preserve">(</w:t>
+      </w:r>
+      <w:r>
+        <w:rPr>
+          <w:rStyle w:val="VerbatimChar"/>
+        </w:rPr>
+        <w:t xml:space="preserve">WATHIQ_OLLAMA_SMOKE=1 dotnet test --filter Rag_Eval</w:t>
+      </w:r>
+      <w:r>
+        <w:t xml:space="preserve">).</w:t>
+      </w:r>
+      <w:r>
+        <w:t xml:space="preserve"> </w:t>
+      </w:r>
+      <w:r>
+        <w:rPr>
+          <w:bCs/>
+          <w:b/>
+        </w:rPr>
+        <w:t xml:space="preserve">Results:</w:t>
+      </w:r>
+      <w:r>
+        <w:t xml:space="preserve"> </w:t>
+      </w:r>
+      <w:r>
+        <w:rPr>
+          <w:iCs/>
+          <w:i/>
+        </w:rPr>
+        <w:t xml:space="preserve">pending the first</w:t>
+      </w:r>
+      <w:r>
+        <w:rPr>
+          <w:iCs/>
+          <w:i/>
+        </w:rPr>
+        <w:t xml:space="preserve"> </w:t>
+      </w:r>
+      <w:r>
+        <w:rPr>
+          <w:iCs/>
+          <w:i/>
+        </w:rPr>
+        <w:t xml:space="preserve">dev-box run.</w:t>
+      </w:r>
+    </w:p>
+    <w:bookmarkEnd w:id="28"/>
+    <w:bookmarkStart w:id="29" w:name="planned-hardening"/>
+    <w:p>
+      <w:pPr>
+        <w:pStyle w:val="Heading1"/>
+      </w:pPr>
+      <w:r>
+        <w:t xml:space="preserve">9. Planned hardening</w:t>
+      </w:r>
+    </w:p>
+    <w:p>
+      <w:pPr>
+        <w:numPr>
+          <w:ilvl w:val="0"/>
+          <w:numId w:val="1007"/>
+        </w:numPr>
+        <w:pStyle w:val="Compact"/>
+      </w:pPr>
+      <w:r>
+        <w:t xml:space="preserve">P8: encryption at rest for attachments and</w:t>
+      </w:r>
+      <w:r>
+        <w:t xml:space="preserve"> </w:t>
+      </w:r>
+      <w:r>
+        <w:rPr>
+          <w:rStyle w:val="VerbatimChar"/>
+        </w:rPr>
+        <w:t xml:space="preserve">OcrText</w:t>
+      </w:r>
+      <w:r>
+        <w:t xml:space="preserve">/</w:t>
+      </w:r>
+      <w:r>
+        <w:rPr>
+          <w:rStyle w:val="VerbatimChar"/>
+        </w:rPr>
+        <w:t xml:space="preserve">RawJson</w:t>
+      </w:r>
+      <w:r>
+        <w:t xml:space="preserve">; purge of extraction PII 90</w:t>
+      </w:r>
+      <w:r>
+        <w:t xml:space="preserve"> </w:t>
+      </w:r>
+      <w:r>
+        <w:t xml:space="preserve">days after acceptance; hard-delete flow.</w:t>
+      </w:r>
+    </w:p>
+    <w:p>
+      <w:pPr>
+        <w:numPr>
+          <w:ilvl w:val="0"/>
+          <w:numId w:val="1007"/>
+        </w:numPr>
+        <w:pStyle w:val="Compact"/>
+      </w:pPr>
+      <w:r>
+        <w:t xml:space="preserve">Phase 5: guides RAG grounding + citation checks (its own section here when built).</w:t>
+      </w:r>
+    </w:p>
+    <w:p>
+      <w:pPr>
+        <w:numPr>
+          <w:ilvl w:val="0"/>
+          <w:numId w:val="1007"/>
+        </w:numPr>
+        <w:pStyle w:val="Compact"/>
+      </w:pPr>
+      <w:r>
         <w:t xml:space="preserve">Baseline-pinned eval threshold once ≥2 prompt versions exist.</w:t>
       </w:r>
     </w:p>
-    <w:bookmarkEnd w:id="28"/>
+    <w:bookmarkEnd w:id="29"/>
     <w:sectPr>
       <w:footnotePr>
         <w:numRestart w:val="eachSect"/>
@@ -2421,6 +3213,91 @@
     <w:lvl w:ilvl="8">
       <w:numFmt w:val="bullet"/>
       <w:lvlText w:val="•"/>
+      <w:lvlJc w:val="left"/>
+      <w:pPr>
+        <w:ind w:left="6480" w:hanging="480"/>
+      </w:pPr>
+    </w:lvl>
+  </w:abstractNum>
+  <w:abstractNum w:abstractNumId="99411">
+    <w:nsid w:val="A99411"/>
+    <w:multiLevelType w:val="multilevel"/>
+    <w:lvl w:ilvl="0">
+      <w:start w:val="1"/>
+      <w:numFmt w:val="decimal"/>
+      <w:lvlText w:val="%1."/>
+      <w:lvlJc w:val="left"/>
+      <w:pPr>
+        <w:ind w:left="720" w:hanging="480"/>
+      </w:pPr>
+    </w:lvl>
+    <w:lvl w:ilvl="1">
+      <w:start w:val="1"/>
+      <w:numFmt w:val="decimal"/>
+      <w:lvlText w:val="%2."/>
+      <w:lvlJc w:val="left"/>
+      <w:pPr>
+        <w:ind w:left="1440" w:hanging="480"/>
+      </w:pPr>
+    </w:lvl>
+    <w:lvl w:ilvl="2">
+      <w:start w:val="1"/>
+      <w:numFmt w:val="decimal"/>
+      <w:lvlText w:val="%3."/>
+      <w:lvlJc w:val="left"/>
+      <w:pPr>
+        <w:ind w:left="2160" w:hanging="480"/>
+      </w:pPr>
+    </w:lvl>
+    <w:lvl w:ilvl="3">
+      <w:start w:val="1"/>
+      <w:numFmt w:val="decimal"/>
+      <w:lvlText w:val="%4."/>
+      <w:lvlJc w:val="left"/>
+      <w:pPr>
+        <w:ind w:left="2880" w:hanging="480"/>
+      </w:pPr>
+    </w:lvl>
+    <w:lvl w:ilvl="4">
+      <w:start w:val="1"/>
+      <w:numFmt w:val="decimal"/>
+      <w:lvlText w:val="%5."/>
+      <w:lvlJc w:val="left"/>
+      <w:pPr>
+        <w:ind w:left="3600" w:hanging="480"/>
+      </w:pPr>
+    </w:lvl>
+    <w:lvl w:ilvl="5">
+      <w:start w:val="1"/>
+      <w:numFmt w:val="decimal"/>
+      <w:lvlText w:val="%6."/>
+      <w:lvlJc w:val="left"/>
+      <w:pPr>
+        <w:ind w:left="4320" w:hanging="480"/>
+      </w:pPr>
+    </w:lvl>
+    <w:lvl w:ilvl="6">
+      <w:start w:val="1"/>
+      <w:numFmt w:val="decimal"/>
+      <w:lvlText w:val="%7."/>
+      <w:lvlJc w:val="left"/>
+      <w:pPr>
+        <w:ind w:left="5040" w:hanging="480"/>
+      </w:pPr>
+    </w:lvl>
+    <w:lvl w:ilvl="7">
+      <w:start w:val="1"/>
+      <w:numFmt w:val="decimal"/>
+      <w:lvlText w:val="%8."/>
+      <w:lvlJc w:val="left"/>
+      <w:pPr>
+        <w:ind w:left="5760" w:hanging="480"/>
+      </w:pPr>
+    </w:lvl>
+    <w:lvl w:ilvl="8">
+      <w:start w:val="1"/>
+      <w:numFmt w:val="decimal"/>
+      <w:lvlText w:val="%9."/>
       <w:lvlJc w:val="left"/>
       <w:pPr>
         <w:ind w:left="6480" w:hanging="480"/>
@@ -2446,6 +3323,36 @@
     <w:abstractNumId w:val="991"/>
   </w:num>
   <w:num w:numId="1006">
+    <w:abstractNumId w:val="99411"/>
+    <w:lvlOverride w:ilvl="0">
+      <w:startOverride w:val="1"/>
+    </w:lvlOverride>
+    <w:lvlOverride w:ilvl="1">
+      <w:startOverride w:val="1"/>
+    </w:lvlOverride>
+    <w:lvlOverride w:ilvl="2">
+      <w:startOverride w:val="1"/>
+    </w:lvlOverride>
+    <w:lvlOverride w:ilvl="3">
+      <w:startOverride w:val="1"/>
+    </w:lvlOverride>
+    <w:lvlOverride w:ilvl="4">
+      <w:startOverride w:val="1"/>
+    </w:lvlOverride>
+    <w:lvlOverride w:ilvl="5">
+      <w:startOverride w:val="1"/>
+    </w:lvlOverride>
+    <w:lvlOverride w:ilvl="6">
+      <w:startOverride w:val="1"/>
+    </w:lvlOverride>
+    <w:lvlOverride w:ilvl="7">
+      <w:startOverride w:val="1"/>
+    </w:lvlOverride>
+    <w:lvlOverride w:ilvl="8">
+      <w:startOverride w:val="1"/>
+    </w:lvlOverride>
+  </w:num>
+  <w:num w:numId="1007">
     <w:abstractNumId w:val="991"/>
   </w:num>
 </w:numbering>

</xml_diff>